<commit_message>
Assignment 5: larger, more readable screenshots
Co-Authored-By: Claude Opus 5.5 <noreply@anthropic.com>
</commit_message>
<xml_diff>
--- a/Assignment5_MultiContainer.docx
+++ b/Assignment5_MultiContainer.docx
@@ -1358,7 +1358,7 @@
       <w:r>
         <w:drawing>
           <wp:inline xmlns:a="http://schemas.openxmlformats.org/drawingml/2006/main" xmlns:pic="http://schemas.openxmlformats.org/drawingml/2006/picture">
-            <wp:extent cx="5943600" cy="1243543"/>
+            <wp:extent cx="5943600" cy="2886704"/>
             <wp:docPr id="3" name="Picture 3"/>
             <wp:cNvGraphicFramePr>
               <a:graphicFrameLocks noChangeAspect="1"/>
@@ -1379,7 +1379,7 @@
                   <pic:spPr>
                     <a:xfrm>
                       <a:off x="0" y="0"/>
-                      <a:ext cx="5943600" cy="1243543"/>
+                      <a:ext cx="5943600" cy="2886704"/>
                     </a:xfrm>
                     <a:prstGeom prst="rect"/>
                   </pic:spPr>
@@ -1409,7 +1409,7 @@
       <w:r>
         <w:drawing>
           <wp:inline xmlns:a="http://schemas.openxmlformats.org/drawingml/2006/main" xmlns:pic="http://schemas.openxmlformats.org/drawingml/2006/picture">
-            <wp:extent cx="5486400" cy="2084832"/>
+            <wp:extent cx="5943600" cy="2052399"/>
             <wp:docPr id="4" name="Picture 4"/>
             <wp:cNvGraphicFramePr>
               <a:graphicFrameLocks noChangeAspect="1"/>
@@ -1430,7 +1430,7 @@
                   <pic:spPr>
                     <a:xfrm>
                       <a:off x="0" y="0"/>
-                      <a:ext cx="5486400" cy="2084832"/>
+                      <a:ext cx="5943600" cy="2052399"/>
                     </a:xfrm>
                     <a:prstGeom prst="rect"/>
                   </pic:spPr>
@@ -1460,7 +1460,7 @@
       <w:r>
         <w:drawing>
           <wp:inline xmlns:a="http://schemas.openxmlformats.org/drawingml/2006/main" xmlns:pic="http://schemas.openxmlformats.org/drawingml/2006/picture">
-            <wp:extent cx="5943600" cy="2454239"/>
+            <wp:extent cx="5943600" cy="2582238"/>
             <wp:docPr id="5" name="Picture 5"/>
             <wp:cNvGraphicFramePr>
               <a:graphicFrameLocks noChangeAspect="1"/>
@@ -1481,7 +1481,7 @@
                   <pic:spPr>
                     <a:xfrm>
                       <a:off x="0" y="0"/>
-                      <a:ext cx="5943600" cy="2454239"/>
+                      <a:ext cx="5943600" cy="2582238"/>
                     </a:xfrm>
                     <a:prstGeom prst="rect"/>
                   </pic:spPr>
@@ -1501,7 +1501,7 @@
         <w:rPr>
           <w:b w:val="0"/>
         </w:rPr>
-        <w:t>5. Environment variables passed to the web container, the value stored in the Redis database, and the web service logs:</w:t>
+        <w:t>5. Environment variables passed to the web container and the visit counter stored in the Redis database:</w:t>
       </w:r>
     </w:p>
     <w:p>
@@ -1511,7 +1511,7 @@
       <w:r>
         <w:drawing>
           <wp:inline xmlns:a="http://schemas.openxmlformats.org/drawingml/2006/main" xmlns:pic="http://schemas.openxmlformats.org/drawingml/2006/picture">
-            <wp:extent cx="5943600" cy="2966235"/>
+            <wp:extent cx="5486400" cy="1949482"/>
             <wp:docPr id="6" name="Picture 6"/>
             <wp:cNvGraphicFramePr>
               <a:graphicFrameLocks noChangeAspect="1"/>
@@ -1532,7 +1532,58 @@
                   <pic:spPr>
                     <a:xfrm>
                       <a:off x="0" y="0"/>
-                      <a:ext cx="5943600" cy="2966235"/>
+                      <a:ext cx="5486400" cy="1949482"/>
+                    </a:xfrm>
+                    <a:prstGeom prst="rect"/>
+                  </pic:spPr>
+                </pic:pic>
+              </a:graphicData>
+            </a:graphic>
+          </wp:inline>
+        </w:drawing>
+      </w:r>
+    </w:p>
+    <w:p>
+      <w:pPr>
+        <w:keepNext/>
+        <w:spacing w:after="80" w:before="0"/>
+      </w:pPr>
+      <w:r>
+        <w:rPr>
+          <w:b w:val="0"/>
+        </w:rPr>
+        <w:t>Web service logs showing the requests handled by the Flask container:</w:t>
+      </w:r>
+    </w:p>
+    <w:p>
+      <w:pPr>
+        <w:spacing w:after="160"/>
+      </w:pPr>
+      <w:r>
+        <w:drawing>
+          <wp:inline xmlns:a="http://schemas.openxmlformats.org/drawingml/2006/main" xmlns:pic="http://schemas.openxmlformats.org/drawingml/2006/picture">
+            <wp:extent cx="5486400" cy="1702904"/>
+            <wp:docPr id="7" name="Picture 7"/>
+            <wp:cNvGraphicFramePr>
+              <a:graphicFrameLocks noChangeAspect="1"/>
+            </wp:cNvGraphicFramePr>
+            <a:graphic>
+              <a:graphicData uri="http://schemas.openxmlformats.org/drawingml/2006/picture">
+                <pic:pic>
+                  <pic:nvPicPr>
+                    <pic:cNvPr id="0" name="a5_logs.png"/>
+                    <pic:cNvPicPr/>
+                  </pic:nvPicPr>
+                  <pic:blipFill>
+                    <a:blip r:embed="rId15"/>
+                    <a:stretch>
+                      <a:fillRect/>
+                    </a:stretch>
+                  </pic:blipFill>
+                  <pic:spPr>
+                    <a:xfrm>
+                      <a:off x="0" y="0"/>
+                      <a:ext cx="5486400" cy="1702904"/>
                     </a:xfrm>
                     <a:prstGeom prst="rect"/>
                   </pic:spPr>
@@ -1563,7 +1614,7 @@
         <w:drawing>
           <wp:inline xmlns:a="http://schemas.openxmlformats.org/drawingml/2006/main" xmlns:pic="http://schemas.openxmlformats.org/drawingml/2006/picture">
             <wp:extent cx="5943600" cy="4502221"/>
-            <wp:docPr id="7" name="Picture 7"/>
+            <wp:docPr id="8" name="Picture 8"/>
             <wp:cNvGraphicFramePr>
               <a:graphicFrameLocks noChangeAspect="1"/>
             </wp:cNvGraphicFramePr>
@@ -1575,7 +1626,7 @@
                     <pic:cNvPicPr/>
                   </pic:nvPicPr>
                   <pic:blipFill>
-                    <a:blip r:embed="rId15"/>
+                    <a:blip r:embed="rId16"/>
                     <a:stretch>
                       <a:fillRect/>
                     </a:stretch>
@@ -1614,7 +1665,7 @@
         <w:drawing>
           <wp:inline xmlns:a="http://schemas.openxmlformats.org/drawingml/2006/main" xmlns:pic="http://schemas.openxmlformats.org/drawingml/2006/picture">
             <wp:extent cx="5943600" cy="2966235"/>
-            <wp:docPr id="8" name="Picture 8"/>
+            <wp:docPr id="9" name="Picture 9"/>
             <wp:cNvGraphicFramePr>
               <a:graphicFrameLocks noChangeAspect="1"/>
             </wp:cNvGraphicFramePr>
@@ -1626,7 +1677,7 @@
                     <pic:cNvPicPr/>
                   </pic:nvPicPr>
                   <pic:blipFill>
-                    <a:blip r:embed="rId16"/>
+                    <a:blip r:embed="rId17"/>
                     <a:stretch>
                       <a:fillRect/>
                     </a:stretch>

</xml_diff>